<commit_message>
feat(suisse): MAB BUILD Suisse v2 — Estimation B BRG CH intégrée (120 M CHF taps 2019, Non-Housing 4,71%)
Co-Authored-By: Claude Sonnet 4.6 <noreply@anthropic.com>
</commit_message>
<xml_diff>
--- a/pays/suisse/outputs/MAB_Suisse_Annexes.docx
+++ b/pays/suisse/outputs/MAB_Suisse_Annexes.docx
@@ -1144,7 +1144,7 @@
           <w:rFonts w:ascii="Calibri" w:hAnsi="Calibri"/>
           <w:color w:val="1F497D"/>
         </w:rPr>
-        <w:t>ANNEXE 2 — CALCUL DÉTAILLÉ EXTRAPOLATION MARCHÉ ROBINETTERIE SUISSE</w:t>
+        <w:t>ANNEXE 2 — DONNÉES DE MARCHÉ ROBINETTERIE SUISSE : ESTIMATION A + ESTIMATION B (BRG)</w:t>
       </w:r>
     </w:p>
     <w:p>
@@ -1152,7 +1152,7 @@
         <w:rPr>
           <w:i/>
         </w:rPr>
-        <w:t>Source base France : Analyse de Marché France — Équipements Sanitaires Automatiques pour Lieux Publics, Presto, décembre 2024. Marché total France 2024 : 485-550 M€ HT.</w:t>
+        <w:t>ESTIMATION A — Extrapolation depuis France (Analyse de Marché France, Presto, déc. 2024. Marché total France 2024 : 485–550 M€ HT.)</w:t>
       </w:r>
     </w:p>
     <w:p/>
@@ -2035,7 +2035,7 @@
                 <w:rFonts w:ascii="Calibri" w:hAnsi="Calibri"/>
                 <w:sz w:val="18"/>
               </w:rPr>
-              <w:t>TOTAL</w:t>
+              <w:t>TOTAL Estimation A</w:t>
             </w:r>
           </w:p>
         </w:tc>
@@ -2107,7 +2107,1355 @@
         <w:rPr>
           <w:sz w:val="18"/>
         </w:rPr>
-        <w:t>Justification ajustement structurel +12% : (1) PIB/hab suisse 1,8× la France → pouvoir d'achat et prix acceptés bien supérieurs ; (2) Marché premium avec exigences qualité élevées sur ERP publics ; (3) Culture d'entretien et de renouvellement rigoureuse ; (4) Prix en CHF supérieurs aux prix EUR à qualité équivalente. Hypothèse à confirmer via entretiens terrain (Meier Tobler, installateurs Suissetec).</w:t>
+        <w:t>Justification +12% : PIB/hab 1,8× France, marché premium, prix CHF supérieurs, culture entretien rigoureuse. À confirmer terrain.</w:t>
+      </w:r>
+    </w:p>
+    <w:p/>
+    <w:p>
+      <w:r>
+        <w:rPr>
+          <w:i/>
+        </w:rPr>
+        <w:t>ESTIMATION B — BRG CH_Bathrooms_Full_Report_2020 (juillet 2020, données 2019). Mesure directe des ventes fabricants en Suisse (taps &amp; mixers, cuisine + sanitaire, tous end-uses).</w:t>
+      </w:r>
+    </w:p>
+    <w:p/>
+    <w:tbl>
+      <w:tblPr>
+        <w:tblStyle w:val="TableGrid"/>
+        <w:tblW w:type="auto" w:w="0"/>
+        <w:tblLook w:firstColumn="1" w:firstRow="1" w:lastColumn="0" w:lastRow="0" w:noHBand="0" w:noVBand="1" w:val="04A0"/>
+      </w:tblPr>
+      <w:tblGrid>
+        <w:gridCol w:w="1881"/>
+        <w:gridCol w:w="1881"/>
+        <w:gridCol w:w="1881"/>
+        <w:gridCol w:w="1881"/>
+        <w:gridCol w:w="1881"/>
+      </w:tblGrid>
+      <w:tr>
+        <w:tc>
+          <w:tcPr>
+            <w:tcW w:type="dxa" w:w="1881"/>
+          </w:tcPr>
+          <w:p>
+            <w:r/>
+            <w:r>
+              <w:rPr>
+                <w:rFonts w:ascii="Calibri" w:hAnsi="Calibri"/>
+                <w:b/>
+                <w:color w:val="1F497D"/>
+                <w:sz w:val="18"/>
+              </w:rPr>
+              <w:t>Segment BRG (2019)</w:t>
+            </w:r>
+          </w:p>
+        </w:tc>
+        <w:tc>
+          <w:tcPr>
+            <w:tcW w:type="dxa" w:w="1881"/>
+          </w:tcPr>
+          <w:p>
+            <w:r/>
+            <w:r>
+              <w:rPr>
+                <w:rFonts w:ascii="Calibri" w:hAnsi="Calibri"/>
+                <w:b/>
+                <w:color w:val="1F497D"/>
+                <w:sz w:val="18"/>
+              </w:rPr>
+              <w:t>Volume (unités)</w:t>
+            </w:r>
+          </w:p>
+        </w:tc>
+        <w:tc>
+          <w:tcPr>
+            <w:tcW w:type="dxa" w:w="1881"/>
+          </w:tcPr>
+          <w:p>
+            <w:r/>
+            <w:r>
+              <w:rPr>
+                <w:rFonts w:ascii="Calibri" w:hAnsi="Calibri"/>
+                <w:b/>
+                <w:color w:val="1F497D"/>
+                <w:sz w:val="18"/>
+              </w:rPr>
+              <w:t>MSP CHF/u</w:t>
+            </w:r>
+          </w:p>
+        </w:tc>
+        <w:tc>
+          <w:tcPr>
+            <w:tcW w:type="dxa" w:w="1881"/>
+          </w:tcPr>
+          <w:p>
+            <w:r/>
+            <w:r>
+              <w:rPr>
+                <w:rFonts w:ascii="Calibri" w:hAnsi="Calibri"/>
+                <w:b/>
+                <w:color w:val="1F497D"/>
+                <w:sz w:val="18"/>
+              </w:rPr>
+              <w:t>Valeur MSP CHF</w:t>
+            </w:r>
+          </w:p>
+        </w:tc>
+        <w:tc>
+          <w:tcPr>
+            <w:tcW w:type="dxa" w:w="1881"/>
+          </w:tcPr>
+          <w:p>
+            <w:r/>
+            <w:r>
+              <w:rPr>
+                <w:rFonts w:ascii="Calibri" w:hAnsi="Calibri"/>
+                <w:b/>
+                <w:color w:val="1F497D"/>
+                <w:sz w:val="18"/>
+              </w:rPr>
+              <w:t>Valeur MSP EUR</w:t>
+            </w:r>
+          </w:p>
+        </w:tc>
+      </w:tr>
+      <w:tr>
+        <w:tc>
+          <w:tcPr>
+            <w:tcW w:type="dxa" w:w="1881"/>
+          </w:tcPr>
+          <w:p>
+            <w:r/>
+            <w:r>
+              <w:rPr>
+                <w:rFonts w:ascii="Calibri" w:hAnsi="Calibri"/>
+                <w:sz w:val="18"/>
+              </w:rPr>
+              <w:t>Bath Taps and Mixers</w:t>
+            </w:r>
+          </w:p>
+        </w:tc>
+        <w:tc>
+          <w:tcPr>
+            <w:tcW w:type="dxa" w:w="1881"/>
+          </w:tcPr>
+          <w:p>
+            <w:r/>
+            <w:r>
+              <w:rPr>
+                <w:rFonts w:ascii="Calibri" w:hAnsi="Calibri"/>
+                <w:sz w:val="18"/>
+              </w:rPr>
+              <w:t>137 000</w:t>
+            </w:r>
+          </w:p>
+        </w:tc>
+        <w:tc>
+          <w:tcPr>
+            <w:tcW w:type="dxa" w:w="1881"/>
+          </w:tcPr>
+          <w:p>
+            <w:r/>
+            <w:r>
+              <w:rPr>
+                <w:rFonts w:ascii="Calibri" w:hAnsi="Calibri"/>
+                <w:sz w:val="18"/>
+              </w:rPr>
+              <w:t>129,25</w:t>
+            </w:r>
+          </w:p>
+        </w:tc>
+        <w:tc>
+          <w:tcPr>
+            <w:tcW w:type="dxa" w:w="1881"/>
+          </w:tcPr>
+          <w:p>
+            <w:r/>
+            <w:r>
+              <w:rPr>
+                <w:rFonts w:ascii="Calibri" w:hAnsi="Calibri"/>
+                <w:sz w:val="18"/>
+              </w:rPr>
+              <w:t>17,71 M CHF</w:t>
+            </w:r>
+          </w:p>
+        </w:tc>
+        <w:tc>
+          <w:tcPr>
+            <w:tcW w:type="dxa" w:w="1881"/>
+          </w:tcPr>
+          <w:p>
+            <w:r/>
+            <w:r>
+              <w:rPr>
+                <w:rFonts w:ascii="Calibri" w:hAnsi="Calibri"/>
+                <w:sz w:val="18"/>
+              </w:rPr>
+              <w:t>15,95 M EUR</w:t>
+            </w:r>
+          </w:p>
+        </w:tc>
+      </w:tr>
+      <w:tr>
+        <w:tc>
+          <w:tcPr>
+            <w:tcW w:type="dxa" w:w="1881"/>
+          </w:tcPr>
+          <w:p>
+            <w:r/>
+            <w:r>
+              <w:rPr>
+                <w:rFonts w:ascii="Calibri" w:hAnsi="Calibri"/>
+                <w:sz w:val="18"/>
+              </w:rPr>
+              <w:t>Bidet Taps and Mixers</w:t>
+            </w:r>
+          </w:p>
+        </w:tc>
+        <w:tc>
+          <w:tcPr>
+            <w:tcW w:type="dxa" w:w="1881"/>
+          </w:tcPr>
+          <w:p>
+            <w:r/>
+            <w:r>
+              <w:rPr>
+                <w:rFonts w:ascii="Calibri" w:hAnsi="Calibri"/>
+                <w:sz w:val="18"/>
+              </w:rPr>
+              <w:t>5 900</w:t>
+            </w:r>
+          </w:p>
+        </w:tc>
+        <w:tc>
+          <w:tcPr>
+            <w:tcW w:type="dxa" w:w="1881"/>
+          </w:tcPr>
+          <w:p>
+            <w:r/>
+            <w:r>
+              <w:rPr>
+                <w:rFonts w:ascii="Calibri" w:hAnsi="Calibri"/>
+                <w:sz w:val="18"/>
+              </w:rPr>
+              <w:t>108,72</w:t>
+            </w:r>
+          </w:p>
+        </w:tc>
+        <w:tc>
+          <w:tcPr>
+            <w:tcW w:type="dxa" w:w="1881"/>
+          </w:tcPr>
+          <w:p>
+            <w:r/>
+            <w:r>
+              <w:rPr>
+                <w:rFonts w:ascii="Calibri" w:hAnsi="Calibri"/>
+                <w:sz w:val="18"/>
+              </w:rPr>
+              <w:t>0,64 M CHF</w:t>
+            </w:r>
+          </w:p>
+        </w:tc>
+        <w:tc>
+          <w:tcPr>
+            <w:tcW w:type="dxa" w:w="1881"/>
+          </w:tcPr>
+          <w:p>
+            <w:r/>
+            <w:r>
+              <w:rPr>
+                <w:rFonts w:ascii="Calibri" w:hAnsi="Calibri"/>
+                <w:sz w:val="18"/>
+              </w:rPr>
+              <w:t>0,58 M EUR</w:t>
+            </w:r>
+          </w:p>
+        </w:tc>
+      </w:tr>
+      <w:tr>
+        <w:tc>
+          <w:tcPr>
+            <w:tcW w:type="dxa" w:w="1881"/>
+          </w:tcPr>
+          <w:p>
+            <w:r/>
+            <w:r>
+              <w:rPr>
+                <w:rFonts w:ascii="Calibri" w:hAnsi="Calibri"/>
+                <w:sz w:val="18"/>
+              </w:rPr>
+              <w:t>Kitchen Taps and Mixers</w:t>
+            </w:r>
+          </w:p>
+        </w:tc>
+        <w:tc>
+          <w:tcPr>
+            <w:tcW w:type="dxa" w:w="1881"/>
+          </w:tcPr>
+          <w:p>
+            <w:r/>
+            <w:r>
+              <w:rPr>
+                <w:rFonts w:ascii="Calibri" w:hAnsi="Calibri"/>
+                <w:sz w:val="18"/>
+              </w:rPr>
+              <w:t>248 500</w:t>
+            </w:r>
+          </w:p>
+        </w:tc>
+        <w:tc>
+          <w:tcPr>
+            <w:tcW w:type="dxa" w:w="1881"/>
+          </w:tcPr>
+          <w:p>
+            <w:r/>
+            <w:r>
+              <w:rPr>
+                <w:rFonts w:ascii="Calibri" w:hAnsi="Calibri"/>
+                <w:sz w:val="18"/>
+              </w:rPr>
+              <w:t>91,03</w:t>
+            </w:r>
+          </w:p>
+        </w:tc>
+        <w:tc>
+          <w:tcPr>
+            <w:tcW w:type="dxa" w:w="1881"/>
+          </w:tcPr>
+          <w:p>
+            <w:r/>
+            <w:r>
+              <w:rPr>
+                <w:rFonts w:ascii="Calibri" w:hAnsi="Calibri"/>
+                <w:sz w:val="18"/>
+              </w:rPr>
+              <w:t>22,62 M CHF</w:t>
+            </w:r>
+          </w:p>
+        </w:tc>
+        <w:tc>
+          <w:tcPr>
+            <w:tcW w:type="dxa" w:w="1881"/>
+          </w:tcPr>
+          <w:p>
+            <w:r/>
+            <w:r>
+              <w:rPr>
+                <w:rFonts w:ascii="Calibri" w:hAnsi="Calibri"/>
+                <w:sz w:val="18"/>
+              </w:rPr>
+              <w:t>20,38 M EUR</w:t>
+            </w:r>
+          </w:p>
+        </w:tc>
+      </w:tr>
+      <w:tr>
+        <w:tc>
+          <w:tcPr>
+            <w:tcW w:type="dxa" w:w="1881"/>
+          </w:tcPr>
+          <w:p>
+            <w:r/>
+            <w:r>
+              <w:rPr>
+                <w:rFonts w:ascii="Calibri" w:hAnsi="Calibri"/>
+                <w:sz w:val="18"/>
+              </w:rPr>
+              <w:t>Shower Taps and Mixers</w:t>
+            </w:r>
+          </w:p>
+        </w:tc>
+        <w:tc>
+          <w:tcPr>
+            <w:tcW w:type="dxa" w:w="1881"/>
+          </w:tcPr>
+          <w:p>
+            <w:r/>
+            <w:r>
+              <w:rPr>
+                <w:rFonts w:ascii="Calibri" w:hAnsi="Calibri"/>
+                <w:sz w:val="18"/>
+              </w:rPr>
+              <w:t>227 000</w:t>
+            </w:r>
+          </w:p>
+        </w:tc>
+        <w:tc>
+          <w:tcPr>
+            <w:tcW w:type="dxa" w:w="1881"/>
+          </w:tcPr>
+          <w:p>
+            <w:r/>
+            <w:r>
+              <w:rPr>
+                <w:rFonts w:ascii="Calibri" w:hAnsi="Calibri"/>
+                <w:sz w:val="18"/>
+              </w:rPr>
+              <w:t>129,76</w:t>
+            </w:r>
+          </w:p>
+        </w:tc>
+        <w:tc>
+          <w:tcPr>
+            <w:tcW w:type="dxa" w:w="1881"/>
+          </w:tcPr>
+          <w:p>
+            <w:r/>
+            <w:r>
+              <w:rPr>
+                <w:rFonts w:ascii="Calibri" w:hAnsi="Calibri"/>
+                <w:sz w:val="18"/>
+              </w:rPr>
+              <w:t>29,46 M CHF</w:t>
+            </w:r>
+          </w:p>
+        </w:tc>
+        <w:tc>
+          <w:tcPr>
+            <w:tcW w:type="dxa" w:w="1881"/>
+          </w:tcPr>
+          <w:p>
+            <w:r/>
+            <w:r>
+              <w:rPr>
+                <w:rFonts w:ascii="Calibri" w:hAnsi="Calibri"/>
+                <w:sz w:val="18"/>
+              </w:rPr>
+              <w:t>26,54 M EUR</w:t>
+            </w:r>
+          </w:p>
+        </w:tc>
+      </w:tr>
+      <w:tr>
+        <w:tc>
+          <w:tcPr>
+            <w:tcW w:type="dxa" w:w="1881"/>
+          </w:tcPr>
+          <w:p>
+            <w:r/>
+            <w:r>
+              <w:rPr>
+                <w:rFonts w:ascii="Calibri" w:hAnsi="Calibri"/>
+                <w:sz w:val="18"/>
+              </w:rPr>
+              <w:t>Washbasin Taps and Mixers</w:t>
+            </w:r>
+          </w:p>
+        </w:tc>
+        <w:tc>
+          <w:tcPr>
+            <w:tcW w:type="dxa" w:w="1881"/>
+          </w:tcPr>
+          <w:p>
+            <w:r/>
+            <w:r>
+              <w:rPr>
+                <w:rFonts w:ascii="Calibri" w:hAnsi="Calibri"/>
+                <w:sz w:val="18"/>
+              </w:rPr>
+              <w:t>496 000</w:t>
+            </w:r>
+          </w:p>
+        </w:tc>
+        <w:tc>
+          <w:tcPr>
+            <w:tcW w:type="dxa" w:w="1881"/>
+          </w:tcPr>
+          <w:p>
+            <w:r/>
+            <w:r>
+              <w:rPr>
+                <w:rFonts w:ascii="Calibri" w:hAnsi="Calibri"/>
+                <w:sz w:val="18"/>
+              </w:rPr>
+              <w:t>100,15</w:t>
+            </w:r>
+          </w:p>
+        </w:tc>
+        <w:tc>
+          <w:tcPr>
+            <w:tcW w:type="dxa" w:w="1881"/>
+          </w:tcPr>
+          <w:p>
+            <w:r/>
+            <w:r>
+              <w:rPr>
+                <w:rFonts w:ascii="Calibri" w:hAnsi="Calibri"/>
+                <w:sz w:val="18"/>
+              </w:rPr>
+              <w:t>49,67 M CHF</w:t>
+            </w:r>
+          </w:p>
+        </w:tc>
+        <w:tc>
+          <w:tcPr>
+            <w:tcW w:type="dxa" w:w="1881"/>
+          </w:tcPr>
+          <w:p>
+            <w:r/>
+            <w:r>
+              <w:rPr>
+                <w:rFonts w:ascii="Calibri" w:hAnsi="Calibri"/>
+                <w:sz w:val="18"/>
+              </w:rPr>
+              <w:t>44,75 M EUR</w:t>
+            </w:r>
+          </w:p>
+        </w:tc>
+      </w:tr>
+      <w:tr>
+        <w:tc>
+          <w:tcPr>
+            <w:tcW w:type="dxa" w:w="1881"/>
+          </w:tcPr>
+          <w:p>
+            <w:r/>
+            <w:r>
+              <w:rPr>
+                <w:rFonts w:ascii="Calibri" w:hAnsi="Calibri"/>
+                <w:sz w:val="18"/>
+              </w:rPr>
+              <w:t>TOTAL (2019)</w:t>
+            </w:r>
+          </w:p>
+        </w:tc>
+        <w:tc>
+          <w:tcPr>
+            <w:tcW w:type="dxa" w:w="1881"/>
+          </w:tcPr>
+          <w:p>
+            <w:r/>
+            <w:r>
+              <w:rPr>
+                <w:rFonts w:ascii="Calibri" w:hAnsi="Calibri"/>
+                <w:sz w:val="18"/>
+              </w:rPr>
+              <w:t>1 114 400</w:t>
+            </w:r>
+          </w:p>
+        </w:tc>
+        <w:tc>
+          <w:tcPr>
+            <w:tcW w:type="dxa" w:w="1881"/>
+          </w:tcPr>
+          <w:p>
+            <w:r/>
+            <w:r>
+              <w:rPr>
+                <w:rFonts w:ascii="Calibri" w:hAnsi="Calibri"/>
+                <w:sz w:val="18"/>
+              </w:rPr>
+              <w:t>107,77 moy.</w:t>
+            </w:r>
+          </w:p>
+        </w:tc>
+        <w:tc>
+          <w:tcPr>
+            <w:tcW w:type="dxa" w:w="1881"/>
+          </w:tcPr>
+          <w:p>
+            <w:r/>
+            <w:r>
+              <w:rPr>
+                <w:rFonts w:ascii="Calibri" w:hAnsi="Calibri"/>
+                <w:sz w:val="18"/>
+              </w:rPr>
+              <w:t>120,10 M CHF</w:t>
+            </w:r>
+          </w:p>
+        </w:tc>
+        <w:tc>
+          <w:tcPr>
+            <w:tcW w:type="dxa" w:w="1881"/>
+          </w:tcPr>
+          <w:p>
+            <w:r/>
+            <w:r>
+              <w:rPr>
+                <w:rFonts w:ascii="Calibri" w:hAnsi="Calibri"/>
+                <w:sz w:val="18"/>
+              </w:rPr>
+              <w:t>108,20 M EUR</w:t>
+            </w:r>
+          </w:p>
+        </w:tc>
+      </w:tr>
+    </w:tbl>
+    <w:p/>
+    <w:tbl>
+      <w:tblPr>
+        <w:tblStyle w:val="TableGrid"/>
+        <w:tblW w:type="auto" w:w="0"/>
+        <w:tblLook w:firstColumn="1" w:firstRow="1" w:lastColumn="0" w:lastRow="0" w:noHBand="0" w:noVBand="1" w:val="04A0"/>
+      </w:tblPr>
+      <w:tblGrid>
+        <w:gridCol w:w="2351"/>
+        <w:gridCol w:w="2351"/>
+        <w:gridCol w:w="2351"/>
+        <w:gridCol w:w="2351"/>
+      </w:tblGrid>
+      <w:tr>
+        <w:tc>
+          <w:tcPr>
+            <w:tcW w:type="dxa" w:w="2351"/>
+          </w:tcPr>
+          <w:p>
+            <w:r/>
+            <w:r>
+              <w:rPr>
+                <w:rFonts w:ascii="Calibri" w:hAnsi="Calibri"/>
+                <w:b/>
+                <w:color w:val="1F497D"/>
+                <w:sz w:val="18"/>
+              </w:rPr>
+              <w:t>End-Use (2019)</w:t>
+            </w:r>
+          </w:p>
+        </w:tc>
+        <w:tc>
+          <w:tcPr>
+            <w:tcW w:type="dxa" w:w="2351"/>
+          </w:tcPr>
+          <w:p>
+            <w:r/>
+            <w:r>
+              <w:rPr>
+                <w:rFonts w:ascii="Calibri" w:hAnsi="Calibri"/>
+                <w:b/>
+                <w:color w:val="1F497D"/>
+                <w:sz w:val="18"/>
+              </w:rPr>
+              <w:t>Volume</w:t>
+            </w:r>
+          </w:p>
+        </w:tc>
+        <w:tc>
+          <w:tcPr>
+            <w:tcW w:type="dxa" w:w="2351"/>
+          </w:tcPr>
+          <w:p>
+            <w:r/>
+            <w:r>
+              <w:rPr>
+                <w:rFonts w:ascii="Calibri" w:hAnsi="Calibri"/>
+                <w:b/>
+                <w:color w:val="1F497D"/>
+                <w:sz w:val="18"/>
+              </w:rPr>
+              <w:t>%</w:t>
+            </w:r>
+          </w:p>
+        </w:tc>
+        <w:tc>
+          <w:tcPr>
+            <w:tcW w:type="dxa" w:w="2351"/>
+          </w:tcPr>
+          <w:p>
+            <w:r/>
+            <w:r>
+              <w:rPr>
+                <w:rFonts w:ascii="Calibri" w:hAnsi="Calibri"/>
+                <w:b/>
+                <w:color w:val="1F497D"/>
+                <w:sz w:val="18"/>
+              </w:rPr>
+              <w:t>Valeur nominale (proportionnelle)</w:t>
+            </w:r>
+          </w:p>
+        </w:tc>
+      </w:tr>
+      <w:tr>
+        <w:tc>
+          <w:tcPr>
+            <w:tcW w:type="dxa" w:w="2351"/>
+          </w:tcPr>
+          <w:p>
+            <w:r/>
+            <w:r>
+              <w:rPr>
+                <w:rFonts w:ascii="Calibri" w:hAnsi="Calibri"/>
+                <w:sz w:val="18"/>
+              </w:rPr>
+              <w:t>Housing RMI</w:t>
+            </w:r>
+          </w:p>
+        </w:tc>
+        <w:tc>
+          <w:tcPr>
+            <w:tcW w:type="dxa" w:w="2351"/>
+          </w:tcPr>
+          <w:p>
+            <w:r/>
+            <w:r>
+              <w:rPr>
+                <w:rFonts w:ascii="Calibri" w:hAnsi="Calibri"/>
+                <w:sz w:val="18"/>
+              </w:rPr>
+              <w:t>867 520</w:t>
+            </w:r>
+          </w:p>
+        </w:tc>
+        <w:tc>
+          <w:tcPr>
+            <w:tcW w:type="dxa" w:w="2351"/>
+          </w:tcPr>
+          <w:p>
+            <w:r/>
+            <w:r>
+              <w:rPr>
+                <w:rFonts w:ascii="Calibri" w:hAnsi="Calibri"/>
+                <w:sz w:val="18"/>
+              </w:rPr>
+              <w:t>77,85%</w:t>
+            </w:r>
+          </w:p>
+        </w:tc>
+        <w:tc>
+          <w:tcPr>
+            <w:tcW w:type="dxa" w:w="2351"/>
+          </w:tcPr>
+          <w:p>
+            <w:r/>
+            <w:r>
+              <w:rPr>
+                <w:rFonts w:ascii="Calibri" w:hAnsi="Calibri"/>
+                <w:sz w:val="18"/>
+              </w:rPr>
+              <w:t>93,5 M CHF</w:t>
+            </w:r>
+          </w:p>
+        </w:tc>
+      </w:tr>
+      <w:tr>
+        <w:tc>
+          <w:tcPr>
+            <w:tcW w:type="dxa" w:w="2351"/>
+          </w:tcPr>
+          <w:p>
+            <w:r/>
+            <w:r>
+              <w:rPr>
+                <w:rFonts w:ascii="Calibri" w:hAnsi="Calibri"/>
+                <w:sz w:val="18"/>
+              </w:rPr>
+              <w:t>New Housing</w:t>
+            </w:r>
+          </w:p>
+        </w:tc>
+        <w:tc>
+          <w:tcPr>
+            <w:tcW w:type="dxa" w:w="2351"/>
+          </w:tcPr>
+          <w:p>
+            <w:r/>
+            <w:r>
+              <w:rPr>
+                <w:rFonts w:ascii="Calibri" w:hAnsi="Calibri"/>
+                <w:sz w:val="18"/>
+              </w:rPr>
+              <w:t>194 390</w:t>
+            </w:r>
+          </w:p>
+        </w:tc>
+        <w:tc>
+          <w:tcPr>
+            <w:tcW w:type="dxa" w:w="2351"/>
+          </w:tcPr>
+          <w:p>
+            <w:r/>
+            <w:r>
+              <w:rPr>
+                <w:rFonts w:ascii="Calibri" w:hAnsi="Calibri"/>
+                <w:sz w:val="18"/>
+              </w:rPr>
+              <w:t>17,44%</w:t>
+            </w:r>
+          </w:p>
+        </w:tc>
+        <w:tc>
+          <w:tcPr>
+            <w:tcW w:type="dxa" w:w="2351"/>
+          </w:tcPr>
+          <w:p>
+            <w:r/>
+            <w:r>
+              <w:rPr>
+                <w:rFonts w:ascii="Calibri" w:hAnsi="Calibri"/>
+                <w:sz w:val="18"/>
+              </w:rPr>
+              <w:t>20,9 M CHF</w:t>
+            </w:r>
+          </w:p>
+        </w:tc>
+      </w:tr>
+      <w:tr>
+        <w:tc>
+          <w:tcPr>
+            <w:tcW w:type="dxa" w:w="2351"/>
+          </w:tcPr>
+          <w:p>
+            <w:r/>
+            <w:r>
+              <w:rPr>
+                <w:rFonts w:ascii="Calibri" w:hAnsi="Calibri"/>
+                <w:sz w:val="18"/>
+              </w:rPr>
+              <w:t>Non-Housing (ERP)</w:t>
+            </w:r>
+          </w:p>
+        </w:tc>
+        <w:tc>
+          <w:tcPr>
+            <w:tcW w:type="dxa" w:w="2351"/>
+          </w:tcPr>
+          <w:p>
+            <w:r/>
+            <w:r>
+              <w:rPr>
+                <w:rFonts w:ascii="Calibri" w:hAnsi="Calibri"/>
+                <w:sz w:val="18"/>
+              </w:rPr>
+              <w:t>52 500</w:t>
+            </w:r>
+          </w:p>
+        </w:tc>
+        <w:tc>
+          <w:tcPr>
+            <w:tcW w:type="dxa" w:w="2351"/>
+          </w:tcPr>
+          <w:p>
+            <w:r/>
+            <w:r>
+              <w:rPr>
+                <w:rFonts w:ascii="Calibri" w:hAnsi="Calibri"/>
+                <w:sz w:val="18"/>
+              </w:rPr>
+              <w:t>4,71%</w:t>
+            </w:r>
+          </w:p>
+        </w:tc>
+        <w:tc>
+          <w:tcPr>
+            <w:tcW w:type="dxa" w:w="2351"/>
+          </w:tcPr>
+          <w:p>
+            <w:r/>
+            <w:r>
+              <w:rPr>
+                <w:rFonts w:ascii="Calibri" w:hAnsi="Calibri"/>
+                <w:sz w:val="18"/>
+              </w:rPr>
+              <w:t>5,66 M CHF</w:t>
+            </w:r>
+          </w:p>
+        </w:tc>
+      </w:tr>
+    </w:tbl>
+    <w:p/>
+    <w:tbl>
+      <w:tblPr>
+        <w:tblStyle w:val="TableGrid"/>
+        <w:tblW w:type="auto" w:w="0"/>
+        <w:tblLook w:firstColumn="1" w:firstRow="1" w:lastColumn="0" w:lastRow="0" w:noHBand="0" w:noVBand="1" w:val="04A0"/>
+      </w:tblPr>
+      <w:tblGrid>
+        <w:gridCol w:w="1881"/>
+        <w:gridCol w:w="1881"/>
+        <w:gridCol w:w="1881"/>
+        <w:gridCol w:w="1881"/>
+        <w:gridCol w:w="1881"/>
+      </w:tblGrid>
+      <w:tr>
+        <w:tc>
+          <w:tcPr>
+            <w:tcW w:type="dxa" w:w="1881"/>
+          </w:tcPr>
+          <w:p>
+            <w:r/>
+            <w:r>
+              <w:rPr>
+                <w:rFonts w:ascii="Calibri" w:hAnsi="Calibri"/>
+                <w:b/>
+                <w:color w:val="1F497D"/>
+                <w:sz w:val="18"/>
+              </w:rPr>
+              <w:t>Type (2019)</w:t>
+            </w:r>
+          </w:p>
+        </w:tc>
+        <w:tc>
+          <w:tcPr>
+            <w:tcW w:type="dxa" w:w="1881"/>
+          </w:tcPr>
+          <w:p>
+            <w:r/>
+            <w:r>
+              <w:rPr>
+                <w:rFonts w:ascii="Calibri" w:hAnsi="Calibri"/>
+                <w:b/>
+                <w:color w:val="1F497D"/>
+                <w:sz w:val="18"/>
+              </w:rPr>
+              <w:t>Volume</w:t>
+            </w:r>
+          </w:p>
+        </w:tc>
+        <w:tc>
+          <w:tcPr>
+            <w:tcW w:type="dxa" w:w="1881"/>
+          </w:tcPr>
+          <w:p>
+            <w:r/>
+            <w:r>
+              <w:rPr>
+                <w:rFonts w:ascii="Calibri" w:hAnsi="Calibri"/>
+                <w:b/>
+                <w:color w:val="1F497D"/>
+                <w:sz w:val="18"/>
+              </w:rPr>
+              <w:t>% vol.</w:t>
+            </w:r>
+          </w:p>
+        </w:tc>
+        <w:tc>
+          <w:tcPr>
+            <w:tcW w:type="dxa" w:w="1881"/>
+          </w:tcPr>
+          <w:p>
+            <w:r/>
+            <w:r>
+              <w:rPr>
+                <w:rFonts w:ascii="Calibri" w:hAnsi="Calibri"/>
+                <w:b/>
+                <w:color w:val="1F497D"/>
+                <w:sz w:val="18"/>
+              </w:rPr>
+              <w:t>MSP CHF/u</w:t>
+            </w:r>
+          </w:p>
+        </w:tc>
+        <w:tc>
+          <w:tcPr>
+            <w:tcW w:type="dxa" w:w="1881"/>
+          </w:tcPr>
+          <w:p>
+            <w:r/>
+            <w:r>
+              <w:rPr>
+                <w:rFonts w:ascii="Calibri" w:hAnsi="Calibri"/>
+                <w:b/>
+                <w:color w:val="1F497D"/>
+                <w:sz w:val="18"/>
+              </w:rPr>
+              <w:t>Valeur M CHF</w:t>
+            </w:r>
+          </w:p>
+        </w:tc>
+      </w:tr>
+      <w:tr>
+        <w:tc>
+          <w:tcPr>
+            <w:tcW w:type="dxa" w:w="1881"/>
+          </w:tcPr>
+          <w:p>
+            <w:r/>
+            <w:r>
+              <w:rPr>
+                <w:rFonts w:ascii="Calibri" w:hAnsi="Calibri"/>
+                <w:sz w:val="18"/>
+              </w:rPr>
+              <w:t>Electronic (infrarouge)</w:t>
+            </w:r>
+          </w:p>
+        </w:tc>
+        <w:tc>
+          <w:tcPr>
+            <w:tcW w:type="dxa" w:w="1881"/>
+          </w:tcPr>
+          <w:p>
+            <w:r/>
+            <w:r>
+              <w:rPr>
+                <w:rFonts w:ascii="Calibri" w:hAnsi="Calibri"/>
+                <w:sz w:val="18"/>
+              </w:rPr>
+              <w:t>5 530</w:t>
+            </w:r>
+          </w:p>
+        </w:tc>
+        <w:tc>
+          <w:tcPr>
+            <w:tcW w:type="dxa" w:w="1881"/>
+          </w:tcPr>
+          <w:p>
+            <w:r/>
+            <w:r>
+              <w:rPr>
+                <w:rFonts w:ascii="Calibri" w:hAnsi="Calibri"/>
+                <w:sz w:val="18"/>
+              </w:rPr>
+              <w:t>0,50%</w:t>
+            </w:r>
+          </w:p>
+        </w:tc>
+        <w:tc>
+          <w:tcPr>
+            <w:tcW w:type="dxa" w:w="1881"/>
+          </w:tcPr>
+          <w:p>
+            <w:r/>
+            <w:r>
+              <w:rPr>
+                <w:rFonts w:ascii="Calibri" w:hAnsi="Calibri"/>
+                <w:sz w:val="18"/>
+              </w:rPr>
+              <w:t>194,59</w:t>
+            </w:r>
+          </w:p>
+        </w:tc>
+        <w:tc>
+          <w:tcPr>
+            <w:tcW w:type="dxa" w:w="1881"/>
+          </w:tcPr>
+          <w:p>
+            <w:r/>
+            <w:r>
+              <w:rPr>
+                <w:rFonts w:ascii="Calibri" w:hAnsi="Calibri"/>
+                <w:sz w:val="18"/>
+              </w:rPr>
+              <w:t>1,08</w:t>
+            </w:r>
+          </w:p>
+        </w:tc>
+      </w:tr>
+      <w:tr>
+        <w:tc>
+          <w:tcPr>
+            <w:tcW w:type="dxa" w:w="1881"/>
+          </w:tcPr>
+          <w:p>
+            <w:r/>
+            <w:r>
+              <w:rPr>
+                <w:rFonts w:ascii="Calibri" w:hAnsi="Calibri"/>
+                <w:sz w:val="18"/>
+              </w:rPr>
+              <w:t>Self-Closing (temporisés)</w:t>
+            </w:r>
+          </w:p>
+        </w:tc>
+        <w:tc>
+          <w:tcPr>
+            <w:tcW w:type="dxa" w:w="1881"/>
+          </w:tcPr>
+          <w:p>
+            <w:r/>
+            <w:r>
+              <w:rPr>
+                <w:rFonts w:ascii="Calibri" w:hAnsi="Calibri"/>
+                <w:sz w:val="18"/>
+              </w:rPr>
+              <w:t>1 080</w:t>
+            </w:r>
+          </w:p>
+        </w:tc>
+        <w:tc>
+          <w:tcPr>
+            <w:tcW w:type="dxa" w:w="1881"/>
+          </w:tcPr>
+          <w:p>
+            <w:r/>
+            <w:r>
+              <w:rPr>
+                <w:rFonts w:ascii="Calibri" w:hAnsi="Calibri"/>
+                <w:sz w:val="18"/>
+              </w:rPr>
+              <w:t>0,10%</w:t>
+            </w:r>
+          </w:p>
+        </w:tc>
+        <w:tc>
+          <w:tcPr>
+            <w:tcW w:type="dxa" w:w="1881"/>
+          </w:tcPr>
+          <w:p>
+            <w:r/>
+            <w:r>
+              <w:rPr>
+                <w:rFonts w:ascii="Calibri" w:hAnsi="Calibri"/>
+                <w:sz w:val="18"/>
+              </w:rPr>
+              <w:t>131,46</w:t>
+            </w:r>
+          </w:p>
+        </w:tc>
+        <w:tc>
+          <w:tcPr>
+            <w:tcW w:type="dxa" w:w="1881"/>
+          </w:tcPr>
+          <w:p>
+            <w:r/>
+            <w:r>
+              <w:rPr>
+                <w:rFonts w:ascii="Calibri" w:hAnsi="Calibri"/>
+                <w:sz w:val="18"/>
+              </w:rPr>
+              <w:t>0,14</w:t>
+            </w:r>
+          </w:p>
+        </w:tc>
+      </w:tr>
+      <w:tr>
+        <w:tc>
+          <w:tcPr>
+            <w:tcW w:type="dxa" w:w="1881"/>
+          </w:tcPr>
+          <w:p>
+            <w:r/>
+            <w:r>
+              <w:rPr>
+                <w:rFonts w:ascii="Calibri" w:hAnsi="Calibri"/>
+                <w:sz w:val="18"/>
+              </w:rPr>
+              <w:t>Thermostatic</w:t>
+            </w:r>
+          </w:p>
+        </w:tc>
+        <w:tc>
+          <w:tcPr>
+            <w:tcW w:type="dxa" w:w="1881"/>
+          </w:tcPr>
+          <w:p>
+            <w:r/>
+            <w:r>
+              <w:rPr>
+                <w:rFonts w:ascii="Calibri" w:hAnsi="Calibri"/>
+                <w:sz w:val="18"/>
+              </w:rPr>
+              <w:t>79 330</w:t>
+            </w:r>
+          </w:p>
+        </w:tc>
+        <w:tc>
+          <w:tcPr>
+            <w:tcW w:type="dxa" w:w="1881"/>
+          </w:tcPr>
+          <w:p>
+            <w:r/>
+            <w:r>
+              <w:rPr>
+                <w:rFonts w:ascii="Calibri" w:hAnsi="Calibri"/>
+                <w:sz w:val="18"/>
+              </w:rPr>
+              <w:t>7,12%</w:t>
+            </w:r>
+          </w:p>
+        </w:tc>
+        <w:tc>
+          <w:tcPr>
+            <w:tcW w:type="dxa" w:w="1881"/>
+          </w:tcPr>
+          <w:p>
+            <w:r/>
+            <w:r>
+              <w:rPr>
+                <w:rFonts w:ascii="Calibri" w:hAnsi="Calibri"/>
+                <w:sz w:val="18"/>
+              </w:rPr>
+              <w:t>156,29</w:t>
+            </w:r>
+          </w:p>
+        </w:tc>
+        <w:tc>
+          <w:tcPr>
+            <w:tcW w:type="dxa" w:w="1881"/>
+          </w:tcPr>
+          <w:p>
+            <w:r/>
+            <w:r>
+              <w:rPr>
+                <w:rFonts w:ascii="Calibri" w:hAnsi="Calibri"/>
+                <w:sz w:val="18"/>
+              </w:rPr>
+              <w:t>12,40</w:t>
+            </w:r>
+          </w:p>
+        </w:tc>
+      </w:tr>
+      <w:tr>
+        <w:tc>
+          <w:tcPr>
+            <w:tcW w:type="dxa" w:w="1881"/>
+          </w:tcPr>
+          <w:p>
+            <w:r/>
+            <w:r>
+              <w:rPr>
+                <w:rFonts w:ascii="Calibri" w:hAnsi="Calibri"/>
+                <w:sz w:val="18"/>
+              </w:rPr>
+              <w:t>One Head (mitigeurs)</w:t>
+            </w:r>
+          </w:p>
+        </w:tc>
+        <w:tc>
+          <w:tcPr>
+            <w:tcW w:type="dxa" w:w="1881"/>
+          </w:tcPr>
+          <w:p>
+            <w:r/>
+            <w:r>
+              <w:rPr>
+                <w:rFonts w:ascii="Calibri" w:hAnsi="Calibri"/>
+                <w:sz w:val="18"/>
+              </w:rPr>
+              <w:t>1 001 510</w:t>
+            </w:r>
+          </w:p>
+        </w:tc>
+        <w:tc>
+          <w:tcPr>
+            <w:tcW w:type="dxa" w:w="1881"/>
+          </w:tcPr>
+          <w:p>
+            <w:r/>
+            <w:r>
+              <w:rPr>
+                <w:rFonts w:ascii="Calibri" w:hAnsi="Calibri"/>
+                <w:sz w:val="18"/>
+              </w:rPr>
+              <w:t>89,87%</w:t>
+            </w:r>
+          </w:p>
+        </w:tc>
+        <w:tc>
+          <w:tcPr>
+            <w:tcW w:type="dxa" w:w="1881"/>
+          </w:tcPr>
+          <w:p>
+            <w:r/>
+            <w:r>
+              <w:rPr>
+                <w:rFonts w:ascii="Calibri" w:hAnsi="Calibri"/>
+                <w:sz w:val="18"/>
+              </w:rPr>
+              <w:t>103,79</w:t>
+            </w:r>
+          </w:p>
+        </w:tc>
+        <w:tc>
+          <w:tcPr>
+            <w:tcW w:type="dxa" w:w="1881"/>
+          </w:tcPr>
+          <w:p>
+            <w:r/>
+            <w:r>
+              <w:rPr>
+                <w:rFonts w:ascii="Calibri" w:hAnsi="Calibri"/>
+                <w:sz w:val="18"/>
+              </w:rPr>
+              <w:t>103,95</w:t>
+            </w:r>
+          </w:p>
+        </w:tc>
+      </w:tr>
+      <w:tr>
+        <w:tc>
+          <w:tcPr>
+            <w:tcW w:type="dxa" w:w="1881"/>
+          </w:tcPr>
+          <w:p>
+            <w:r/>
+            <w:r>
+              <w:rPr>
+                <w:rFonts w:ascii="Calibri" w:hAnsi="Calibri"/>
+                <w:sz w:val="18"/>
+              </w:rPr>
+              <w:t>Two Head</w:t>
+            </w:r>
+          </w:p>
+        </w:tc>
+        <w:tc>
+          <w:tcPr>
+            <w:tcW w:type="dxa" w:w="1881"/>
+          </w:tcPr>
+          <w:p>
+            <w:r/>
+            <w:r>
+              <w:rPr>
+                <w:rFonts w:ascii="Calibri" w:hAnsi="Calibri"/>
+                <w:sz w:val="18"/>
+              </w:rPr>
+              <w:t>26 270</w:t>
+            </w:r>
+          </w:p>
+        </w:tc>
+        <w:tc>
+          <w:tcPr>
+            <w:tcW w:type="dxa" w:w="1881"/>
+          </w:tcPr>
+          <w:p>
+            <w:r/>
+            <w:r>
+              <w:rPr>
+                <w:rFonts w:ascii="Calibri" w:hAnsi="Calibri"/>
+                <w:sz w:val="18"/>
+              </w:rPr>
+              <w:t>2,36%</w:t>
+            </w:r>
+          </w:p>
+        </w:tc>
+        <w:tc>
+          <w:tcPr>
+            <w:tcW w:type="dxa" w:w="1881"/>
+          </w:tcPr>
+          <w:p>
+            <w:r/>
+            <w:r>
+              <w:rPr>
+                <w:rFonts w:ascii="Calibri" w:hAnsi="Calibri"/>
+                <w:sz w:val="18"/>
+              </w:rPr>
+              <w:t>94,48</w:t>
+            </w:r>
+          </w:p>
+        </w:tc>
+        <w:tc>
+          <w:tcPr>
+            <w:tcW w:type="dxa" w:w="1881"/>
+          </w:tcPr>
+          <w:p>
+            <w:r/>
+            <w:r>
+              <w:rPr>
+                <w:rFonts w:ascii="Calibri" w:hAnsi="Calibri"/>
+                <w:sz w:val="18"/>
+              </w:rPr>
+              <w:t>2,40</w:t>
+            </w:r>
+          </w:p>
+        </w:tc>
+      </w:tr>
+    </w:tbl>
+    <w:p/>
+    <w:p>
+      <w:r>
+        <w:rPr>
+          <w:sz w:val="18"/>
+        </w:rPr>
+        <w:t>Calcul Estimation B (robinetterie collective ERP) : Non-Housing 4,71% × 120,10 M CHF = 5,66 M CHF → ajustement prix ERP ×1,80 (self-closing 131 CHF/u + electronic 195 CHF/u vs moy. 108 CHF/u) = 10,2 M CHF → mise à jour 2019→2024 (prix +16%) = ~11,8 M CHF ≈ ~11 M EUR. Fourchette retenue : 9–11 M EUR.</w:t>
+      </w:r>
+    </w:p>
+    <w:p/>
+    <w:p>
+      <w:r>
+        <w:rPr>
+          <w:sz w:val="18"/>
+        </w:rPr>
+        <w:t>Prévision volume 2024 (BRG p.110) : 1 086 800 unités (-2,5% vs 2019). Valeur estimée 2024 toutes taps CH : ~136 M CHF / ~129 M EUR (hypothèse prix +3%/an sur 5 ans).</w:t>
       </w:r>
     </w:p>
     <w:p/>
@@ -7934,7 +9282,7 @@
                 <w:rFonts w:ascii="Calibri" w:hAnsi="Calibri"/>
                 <w:sz w:val="16"/>
               </w:rPr>
-              <w:t>Étude BRG Suisse</w:t>
+              <w:t>Étude BRG Suisse (CH_Bathrooms_Full_Report_2020)</w:t>
             </w:r>
           </w:p>
         </w:tc>
@@ -7949,7 +9297,7 @@
                 <w:rFonts w:ascii="Calibri" w:hAnsi="Calibri"/>
                 <w:sz w:val="16"/>
               </w:rPr>
-              <w:t>NON DISPONIBLE</w:t>
+              <w:t>Total taps CH 2019 : 120,10 M CHF / 108,20 M EUR. Non-Housing 4,71%. Self-closing 1 080u/0,14 M CHF. Electronic 5 530u/1,08 M CHF.</w:t>
             </w:r>
           </w:p>
         </w:tc>
@@ -7964,7 +9312,7 @@
                 <w:rFonts w:ascii="Calibri" w:hAnsi="Calibri"/>
                 <w:sz w:val="16"/>
               </w:rPr>
-              <w:t>—</w:t>
+              <w:t>BRG Building Solutions, juil. 2020, p.102/109/103</w:t>
             </w:r>
           </w:p>
         </w:tc>
@@ -7979,7 +9327,7 @@
                 <w:rFonts w:ascii="Calibri" w:hAnsi="Calibri"/>
                 <w:sz w:val="16"/>
               </w:rPr>
-              <w:t>—</w:t>
+              <w:t>Très haute (données directes fabricants)</w:t>
             </w:r>
           </w:p>
         </w:tc>
@@ -7994,7 +9342,7 @@
                 <w:rFonts w:ascii="Calibri" w:hAnsi="Calibri"/>
                 <w:sz w:val="16"/>
               </w:rPr>
-              <w:t>BRG Building Solutions</w:t>
+              <w:t>Mise à jour post-2020 ; segmentation ERP fine à affiner</w:t>
             </w:r>
           </w:p>
         </w:tc>

</xml_diff>